<commit_message>
Deutsch 11: Kafka – Abschnitt A im Unterrichtsgespräch, Matrix im Hefter
Co-Authored-By: Claude Opus 5.5 <noreply@anthropic.com>
Claude-Session: https://claude.ai/code/session_01Kzh1oWiqhC6W8oSNq8mKnj
</commit_message>
<xml_diff>
--- a/Deutsch_11/Kafka_Brief_an_den_Vater/Tafelbild_Schrittfolge.docx
+++ b/Deutsch_11/Kafka_Brief_an_den_Vater/Tafelbild_Schrittfolge.docx
@@ -24,7 +24,7 @@
           <w:sz w:val="17"/>
           <w:szCs w:val="17"/>
         </w:rPr>
-        <w:t xml:space="preserve">① Abschnitt A: erst allein, dann gemeinsame Matrix · ② Abschnitt C: allein, dann an der Tafel zusammentragen · ③ These prüfen · ④ Matrix in Fließtext überführen</w:t>
+        <w:t xml:space="preserve">① Abschnitt A: im Unterrichtsgespräch, Matrix wächst an der Tafel und im Hefter · ② Abschnitt C: allein, dann an der Tafel zusammentragen · ③ These prüfen · ④ Matrix in Fließtext überführen</w:t>
       </w:r>
     </w:p>
     <w:tbl>
@@ -235,7 +235,7 @@
                 <w:sz w:val="23"/>
                 <w:szCs w:val="23"/>
               </w:rPr>
-              <w:t xml:space="preserve">A  Redeverbot – gemeinsam</w:t>
+              <w:t xml:space="preserve">A  Redeverbot – gemeinsam im Unterrichtsgespräch</w:t>
             </w:r>
             <w:r>
               <w:rPr>
@@ -246,7 +246,7 @@
                 <w:sz w:val="19"/>
                 <w:szCs w:val="19"/>
               </w:rPr>
-              <w:t xml:space="preserve">   „ich verlernte das Reden“ (S. 5 f.)</w:t>
+              <w:t xml:space="preserve">   „ich verlernte das Reden“ (S. 5 f.) · Matrix in den Hefter übernehmen</w:t>
             </w:r>
           </w:p>
         </w:tc>

</xml_diff>

<commit_message>
Kafka: Arbeitsauftrag Fließtext mit Operatoren (Analysiere/Beurteile) auf Folie, Tafelbild und Tafelscript
Co-Authored-By: Claude Opus 5.5 <noreply@anthropic.com>
Claude-Session: https://claude.ai/code/session_01Kzh1oWiqhC6W8oSNq8mKnj
</commit_message>
<xml_diff>
--- a/Deutsch_11/Kafka_Brief_an_den_Vater/Tafelbild_Schrittfolge.docx
+++ b/Deutsch_11/Kafka_Brief_an_den_Vater/Tafelbild_Schrittfolge.docx
@@ -1726,7 +1726,47 @@
                 <w:sz w:val="20"/>
                 <w:szCs w:val="20"/>
               </w:rPr>
-              <w:t xml:space="preserve">   Schreibe deine Analyse von A und C als zusammenhängenden Text.</w:t>
+              <w:t xml:space="preserve">   </w:t>
+            </w:r>
+            <w:r>
+              <w:rPr>
+                <w:rFonts w:ascii="Calibri" w:cs="Calibri" w:eastAsia="Calibri" w:hAnsi="Calibri"/>
+                <w:b/>
+                <w:bCs/>
+                <w:color w:val="F3F1EA"/>
+                <w:sz w:val="20"/>
+                <w:szCs w:val="20"/>
+              </w:rPr>
+              <w:t xml:space="preserve">Analysiere</w:t>
+            </w:r>
+            <w:r>
+              <w:rPr>
+                <w:rFonts w:ascii="Calibri" w:cs="Calibri" w:eastAsia="Calibri" w:hAnsi="Calibri"/>
+                <w:color w:val="F3F1EA"/>
+                <w:sz w:val="20"/>
+                <w:szCs w:val="20"/>
+              </w:rPr>
+              <w:t xml:space="preserve"> die Kommunikation in A und C mithilfe der Modelle und </w:t>
+            </w:r>
+            <w:r>
+              <w:rPr>
+                <w:rFonts w:ascii="Calibri" w:cs="Calibri" w:eastAsia="Calibri" w:hAnsi="Calibri"/>
+                <w:b/>
+                <w:bCs/>
+                <w:color w:val="F3F1EA"/>
+                <w:sz w:val="20"/>
+                <w:szCs w:val="20"/>
+              </w:rPr>
+              <w:t xml:space="preserve">beurteile</w:t>
+            </w:r>
+            <w:r>
+              <w:rPr>
+                <w:rFonts w:ascii="Calibri" w:cs="Calibri" w:eastAsia="Calibri" w:hAnsi="Calibri"/>
+                <w:color w:val="F3F1EA"/>
+                <w:sz w:val="20"/>
+                <w:szCs w:val="20"/>
+              </w:rPr>
+              <w:t xml:space="preserve">, inwieweit die These zutrifft.</w:t>
             </w:r>
           </w:p>
           <w:p>
@@ -1751,7 +1791,7 @@
                 <w:sz w:val="20"/>
                 <w:szCs w:val="20"/>
               </w:rPr>
-              <w:t xml:space="preserve">Einleitung (Wer? An wen? Worum?)  →  je Zeile der Matrix: Behauptung → Beleg (Zitat + Z.) → Erklärung  →  Schluss: These</w:t>
+              <w:t xml:space="preserve">Einleitung (Autor, Titel, Jahr, Thema)  →  je Zeile der Matrix: Behauptung → Beleg (Zitat + Z.) → Erklärung  →  Schluss: begründetes Urteil zur These</w:t>
             </w:r>
           </w:p>
           <w:p>

</xml_diff>